<commit_message>
paper: humanize IFKAD draft v2 - remove em-dash AI tells
Replace 28 parenthetical em-dashes with commas, parentheses, or colons
across abstract, introduction, methodology, results, discussion, and
conclusions. Soften AI-tell phrasings: 'three findings stand out' →
'three findings emerge'; 'effectively functions as' → 'acts as';
'a non-obvious side-effect emerges' → 'an unexpected side-effect
emerges'; drop redundant 'non-obvious' qualifiers where 'invisible to
single-metric evaluation' already carries the meaning.

Preserves all bold/italic run-level formatting, citations, numerical
results, and academic register. Em-dashes retained only where they
appear in a published paper title (Ding et al., 2020) and the meta
draft heading.
</commit_message>
<xml_diff>
--- a/paper/IFKAD2026_Sasso_DeMauro_v2.docx
+++ b/paper/IFKAD2026_Sasso_DeMauro_v2.docx
@@ -136,7 +136,7 @@
         <w:pStyle w:val="FirstParagraph"/>
       </w:pPr>
       <w:r>
-        <w:t xml:space="preserve">Automated Short Answer Grading (ASAG) is increasingly deployed in high-stakes educational contexts, yet the dominant evaluation paradigm reports only agreement with human raters and overlooks an equally important quality dimension: robustness, the consistency of grading behaviour under controlled input transformations. We present a perturbation-first evaluation framework that quantifies robustness along three validity dimensions drawn from Messick’s (1989) taxonomy: invariance (construct-irrelevant variance), sensitivity (construct underrepresentation), and gaming (adversarial manipulation). The framework comprises seven rule-based perturbation generators, two-gate quality validation, and four metrics — IVR_flip, IVR_absdelta, SSR_directional, ASR_thresholded — that compare the grader against itself rather than against gold labels, isolating robustness from accuracy. A dual-protocol design (Leave-One-Question-Out vs. within-question split) quantifies how trained graders degrade under cross-question generalisation. We apply the framework to the SemEval 2013 Beetle corpus (5,199 answers, 42 questions, 41,444 perturbations) and compare a hybrid ML baseline against zero-shot LLM graders (GPT-5.4 mini, Levels 0 and 1). Three findings stand out. First, the trained baseline exhibits a substantial robustness drop under cross-question evaluation: invariance violations rise from 17.9% to 33.7% (+15.8 percentage points), and gaming susceptibility from 11.5% to 18.8%. Standard within-question evaluations therefore overestimate operational reliability. Second, the zero-shot LLM is markedly more robust on invariance and sensitivity dimensions (IVR 0.243 vs 0.337; SSR 0.420 vs 0.140 — a threefold improvement) and substantially less vulnerable to gaming (ASR 0.067 vs 0.188); a fine-grained analysis reveals that the LLM’s residual sensitivity failures follow a stable hierarchy — concept deletions are missed most often, negations intermediately, and outright contradictions least — confirmed by paired McNemar tests (all p&lt;0.001). Third, providing the LLM with the reference answer (Level 1) reduces invariance violations by 45% but simultaneously increases gaming susceptibility by 76% — a non-obvious trade-off invisible to single-metric evaluation. We argue that perturbation-first, multi-dimensional evaluation should complement accuracy metrics in any responsible ASAG deployment, and provide an open-source framework to make this practical.</w:t>
+        <w:t>Automated Short Answer Grading (ASAG) is increasingly deployed in high-stakes educational contexts, yet the dominant evaluation paradigm reports only agreement with human raters and overlooks an equally important quality dimension: robustness, the consistency of grading behaviour under controlled input transformations. We present a perturbation-first evaluation framework that quantifies robustness along three validity dimensions drawn from Messick’s (1989) taxonomy: invariance (construct-irrelevant variance), sensitivity (construct underrepresentation), and gaming (adversarial manipulation). The framework comprises seven rule-based perturbation generators, two-gate quality validation, and four metrics (IVR_flip, IVR_absdelta, SSR_directional, ASR_thresholded) that compare the grader against itself rather than against gold labels, isolating robustness from accuracy. A dual-protocol design (Leave-One-Question-Out vs. within-question split) quantifies how trained graders degrade under cross-question generalisation. We apply the framework to the SemEval 2013 Beetle corpus (5,199 answers, 42 questions, 41,444 perturbations) and compare a hybrid ML baseline against zero-shot LLM graders (GPT-5.4 mini, Levels 0 and 1). Three findings emerge. First, the trained baseline exhibits a substantial robustness drop under cross-question evaluation: invariance violations rise from 17.9% to 33.7% (+15.8 percentage points), and gaming susceptibility from 11.5% to 18.8%. Standard within-question evaluations therefore overestimate operational reliability. Second, the zero-shot LLM is markedly more robust on invariance and sensitivity dimensions (IVR 0.243 vs 0.337; SSR 0.420 vs 0.140, a threefold improvement) and substantially less vulnerable to gaming (ASR 0.067 vs 0.188); a fine-grained analysis reveals that the LLM’s residual sensitivity failures follow a stable hierarchy (concept deletions are missed most often, negations intermediately, and outright contradictions least), confirmed by paired McNemar tests (all p&lt;0.001). Third, providing the LLM with the reference answer (Level 1) reduces invariance violations by 45% but simultaneously increases gaming susceptibility by 76%, a trade-off invisible to single-metric evaluation. We argue that perturbation-first, multi-dimensional evaluation should complement accuracy metrics in any responsible ASAG deployment, and provide an open-source framework to make this practical.</w:t>
       </w:r>
     </w:p>
     <w:bookmarkEnd w:id="26"/>
@@ -197,7 +197,7 @@
         <w:pStyle w:val="FirstParagraph"/>
       </w:pPr>
       <w:r>
-        <w:t xml:space="preserve">Automated Short Answer Grading (ASAG) systems assign grades to free-text student responses by comparison with reference answers. The dominant evaluation paradigm — accuracy or Quadratic Weighted Kappa (QWK) against gold labels — reveals an important blind spot: a grader may agree with human raters on clean test data yet behave erratically when inputs vary in superficial, meaning-preserving ways. Such inconsistency violates construct validity and undermines the pedagogical purpose of assessment (Messick, 1989; Williamson et al., 2012). Operational ASAG systems are vulnerable to simple adversarial inputs (Ding et al., 2020; Kumar et al., 2020; Filighera et al., 2024), yet such vulnerabilities remain largely absent from standard benchmarking.</w:t>
+        <w:t>Automated Short Answer Grading (ASAG) systems assign grades to free-text student responses by comparison with reference answers. The dominant evaluation paradigm (accuracy or Quadratic Weighted Kappa against gold labels) reveals an important blind spot: a grader may agree with human raters on clean test data yet behave erratically when inputs vary in superficial, meaning-preserving ways. Such inconsistency violates construct validity and undermines the pedagogical purpose of assessment (Messick, 1989; Williamson et al., 2012). Operational ASAG systems are vulnerable to simple adversarial inputs (Ding et al., 2020; Kumar et al., 2020; Filighera et al., 2024), yet such vulnerabilities remain largely absent from standard benchmarking.</w:t>
       </w:r>
     </w:p>
     <w:p>
@@ -249,7 +249,7 @@
         </w:numPr>
       </w:pPr>
       <w:r>
-        <w:t xml:space="preserve">A cross-paradigm robustness comparison between trained ML and zero-shot LLM graders, including a structured sensitivity-blindness gradient and a non-obvious gaming trade-off introduced by reference-answer prompting.</w:t>
+        <w:t>A cross-paradigm robustness comparison between trained ML and zero-shot LLM graders, including a structured sensitivity-blindness gradient and a gaming trade-off introduced by reference-answer prompting.</w:t>
       </w:r>
     </w:p>
     <w:p>
@@ -304,7 +304,7 @@
         <w:pStyle w:val="ImageCaption"/>
       </w:pPr>
       <w:r>
-        <w:t xml:space="preserve">Figure 1 — Framework overview and headline finding</w:t>
+        <w:t>Figure 1. Framework overview and headline finding</w:t>
       </w:r>
     </w:p>
     <w:p>
@@ -370,7 +370,7 @@
         <w:t xml:space="preserve"> </w:t>
       </w:r>
       <w:r>
-        <w:t xml:space="preserve">it on deletion — the L1 paradox.</w:t>
+        <w:t>it on deletion, the L1 paradox.</w:t>
       </w:r>
     </w:p>
     <w:p>
@@ -422,7 +422,7 @@
         <w:pStyle w:val="FirstParagraph"/>
       </w:pPr>
       <w:r>
-        <w:t xml:space="preserve">The limits of agreement-based evaluation are best understood through construct validity — the degree to which an assessment measures what it claims to measure (Messick, 1989; Kane, 2006). Messick’s framework identifies two principal threats:</w:t>
+        <w:t>The limits of agreement-based evaluation are best understood through construct validity, the degree to which an assessment measures what it claims to measure (Messick, 1989; Kane, 2006). Messick’s framework identifies two principal threats:</w:t>
       </w:r>
       <w:r>
         <w:t xml:space="preserve"> </w:t>
@@ -454,7 +454,7 @@
         <w:t xml:space="preserve"> </w:t>
       </w:r>
       <w:r>
-        <w:t xml:space="preserve">(the assessment fails to capture meaningful aspects of the construct, e.g. a grader missing a negation that inverts meaning). To these, the literature on automated scoring has added a third threat specific to algorithmic systems —</w:t>
+        <w:t>(the assessment fails to capture meaningful aspects of the construct, e.g. a grader missing a negation that inverts meaning). To these, the literature on automated scoring has added a third threat specific to algorithmic systems:</w:t>
       </w:r>
       <w:r>
         <w:t xml:space="preserve"> </w:t>
@@ -705,7 +705,7 @@
           <w:b/>
           <w:bCs/>
         </w:rPr>
-        <w:t xml:space="preserve">Box 1 — Examples</w:t>
+        <w:t>Box 1. Examples</w:t>
       </w:r>
       <w:r>
         <w:t xml:space="preserve"> </w:t>
@@ -1041,7 +1041,7 @@
         <w:t xml:space="preserve"> </w:t>
       </w:r>
       <w:r>
-        <w:t xml:space="preserve">ground truth — whether a candidate variant preserves meaning as intended — and are distinct from the</w:t>
+        <w:t>ground truth (whether a candidate variant preserves meaning as intended) and are distinct from the</w:t>
       </w:r>
       <w:r>
         <w:t xml:space="preserve"> </w:t>
@@ -1203,7 +1203,7 @@
           <w:b/>
           <w:bCs/>
         </w:rPr>
-        <w:t xml:space="preserve">Protocol A (LOQO — Leave-One-Question-Out)</w:t>
+        <w:t>Protocol A (LOQO, Leave-One-Question-Out)</w:t>
       </w:r>
       <w:r>
         <w:t xml:space="preserve"> </w:t>
@@ -1261,7 +1261,7 @@
         <w:t xml:space="preserve"> </w:t>
       </w:r>
       <w:r>
-        <w:t xml:space="preserve">receive an identical prompt regardless of split, so their A and B results are equivalent up to sampling noise; we evaluate them on absolute metrics and compare against the trained baseline’s Protocol A — the most demanding condition.</w:t>
+        <w:t>receive an identical prompt regardless of split, so their A and B results are equivalent up to sampling noise; we evaluate them on absolute metrics and compare against the trained baseline’s Protocol A, the most demanding condition.</w:t>
       </w:r>
     </w:p>
     <w:p>
@@ -1328,7 +1328,7 @@
         <w:t xml:space="preserve"> </w:t>
       </w:r>
       <w:r>
-        <w:t xml:space="preserve">ground truth — whether a generated variant is a valid invariance, sensitivity, or gaming case — is enforced by the two-gate validation described in Section 3.3 and by the rule-based construction of each perturbation type. Robustness metrics themselves do not consult either ground truth: they compare the grader against itself.</w:t>
+        <w:t>ground truth (whether a generated variant is a valid invariance, sensitivity, or gaming case) is enforced by the two-gate validation described in Section 3.3 and by the rule-based construction of each perturbation type. Robustness metrics themselves do not consult either ground truth: they compare the grader against itself.</w:t>
       </w:r>
     </w:p>
     <w:bookmarkEnd w:id="44"/>
@@ -1732,7 +1732,7 @@
         <w:pStyle w:val="FirstParagraph"/>
       </w:pPr>
       <w:r>
-        <w:t xml:space="preserve">Because the zero-shot LLM grader receives an identical prompt regardless of the data split (see Section 3.5), we report its absolute robustness metrics and compare them against the HybridGrader’s Protocol A results — the most demanding evaluation condition for the trained baseline. Table 2 summarises the comparison.</w:t>
+        <w:t>Because the zero-shot LLM grader receives an identical prompt regardless of the data split (see Section 3.5), we report its absolute robustness metrics and compare them against the HybridGrader’s Protocol A results, the most demanding evaluation condition for the trained baseline. Table 2 summarises the comparison.</w:t>
       </w:r>
     </w:p>
     <w:p>
@@ -2024,7 +2024,7 @@
         <w:t xml:space="preserve"> </w:t>
       </w:r>
       <w:r>
-        <w:t xml:space="preserve">GPT-5.4 mini Level 0 achieves IVR_flip of 0.243 versus 0.337 for the HybridGrader under Protocol A (a 28% relative reduction). With the reference answer available (Level 1) invariance violations fall to 0.134 — a 60% reduction over the HybridGrader baseline. The reference acts as a semantic anchor against which meaning-preserving variations are recognised.</w:t>
+        <w:t>GPT-5.4 mini Level 0 achieves IVR_flip of 0.243 versus 0.337 for the HybridGrader under Protocol A (a 28% relative reduction). With the reference answer available (Level 1) invariance violations fall to 0.134, a 60% reduction over the HybridGrader baseline. The reference acts as a semantic anchor against which meaning-preserving variations are recognised.</w:t>
       </w:r>
     </w:p>
     <w:p>
@@ -2060,7 +2060,7 @@
         <w:t xml:space="preserve"> </w:t>
       </w:r>
       <w:r>
-        <w:t xml:space="preserve">Providing the reference answer (Level 1) increases gaming susceptibility by 76% relative to Level 0 (ASR 0.118 vs 0.067). The mechanism is straightforward: the prompt instructs the model to compare the student answer against the reference, so any token overlap with the reference becomes evidence of correctness. When a gaming perturbation injects keywords drawn from the reference into a wrong response, the model registers those keywords as partial understanding. The reference answer effectively functions as a checklist that an adversarial student can copy from. Level 0, lacking this anchor, must judge the answer on its overall coherence and is correspondingly harder to game with surface-level keyword injection.</w:t>
+        <w:t>Providing the reference answer (Level 1) increases gaming susceptibility by 76% relative to Level 0 (ASR 0.118 vs 0.067). The mechanism is straightforward: the prompt instructs the model to compare the student answer against the reference, so any token overlap with the reference becomes evidence of correctness. When a gaming perturbation injects keywords drawn from the reference into a wrong response, the model registers those keywords as partial understanding. The reference answer acts as a checklist that an adversarial student can copy from. Level 0, lacking this anchor, must judge the answer on its overall coherence and is correspondingly harder to game with surface-level keyword injection.</w:t>
       </w:r>
     </w:p>
     <w:p>
@@ -2078,7 +2078,7 @@
         <w:t xml:space="preserve"> </w:t>
       </w:r>
       <w:r>
-        <w:t xml:space="preserve">No metric in isolation tells the full story. On invariance alone, Level 1 dominates Level 0; on gaming alone, Level 0 dominates Level 1; on sensitivity alone, the two are comparable. The same point applies to the trained baseline: under Protocol B its IVR_flip of 0.179 looks reasonable, but SSR_directional of 0.120 reveals that this stability partly reflects indiscrimination — the grader rarely changes its score even when it should. Trade-offs of this kind are only visible through joint evaluation across distinct validity threats.</w:t>
+        <w:t>No metric in isolation tells the full story. On invariance alone, Level 1 dominates Level 0; on gaming alone, Level 0 dominates Level 1; on sensitivity alone, the two are comparable. The same point applies to the trained baseline: under Protocol B its IVR_flip of 0.179 looks reasonable, but SSR_directional of 0.120 reveals that this stability partly reflects indiscrimination: the grader rarely changes its score even when it should. Trade-offs of this kind are only visible through joint evaluation across distinct validity threats.</w:t>
       </w:r>
     </w:p>
     <w:bookmarkEnd w:id="49"/>
@@ -2096,7 +2096,7 @@
         <w:pStyle w:val="FirstParagraph"/>
       </w:pPr>
       <w:r>
-        <w:t xml:space="preserve">To rule out the possibility that the LLM’s lower IVR is an artefact of score compression rather than genuine robustness, we examined the LLM’s label distribution. At Level 0, GPT-5.4 mini exhibits a conservative scoring pattern: 54.3% of answers receive the partially_correct_incomplete label (score 0.5), compared to 23.1% in the gold distribution. This compression toward the midpoint mechanically reduces IVR, since scores at 0.5 have less room to flip to a different value. At Level 1, the distribution becomes substantially more discriminative — closer to the gold distribution — yet IVR_flip continues to fall (0.243 → 0.134). This rules out the score-compression explanation: the LLM’s invariance robustness reflects genuine semantic stability, not statistical artefact.</w:t>
+        <w:t>To rule out the possibility that the LLM’s lower IVR is an artefact of score compression rather than genuine robustness, we examined the LLM’s label distribution. At Level 0, GPT-5.4 mini exhibits a conservative scoring pattern: 54.3% of answers receive the partially_correct_incomplete label (score 0.5), compared to 23.1% in the gold distribution. This compression toward the midpoint mechanically reduces IVR, since scores at 0.5 have less room to flip to a different value. At Level 1, the distribution becomes substantially more discriminative (closer to the gold distribution) yet IVR_flip continues to fall (0.243 → 0.134). This rules out the score-compression explanation: the LLM’s invariance robustness reflects genuine semantic stability, not statistical artefact.</w:t>
       </w:r>
     </w:p>
     <w:p>
@@ -2547,7 +2547,7 @@
         <w:pStyle w:val="BodyText"/>
       </w:pPr>
       <w:r>
-        <w:t xml:space="preserve">Pairwise McNemar tests confirm the gradient is significant (all six within-grader comparisons p &lt; 0.001). A non-obvious side-effect emerges between graders: adding the reference answer (L1) reduces the miss rate on negation (−10 pp) and contradiction (−3 pp) but</w:t>
+        <w:t>Pairwise McNemar tests confirm the gradient is significant (all six within-grader comparisons p &lt; 0.001). An unexpected side-effect emerges between graders: adding the reference answer (L1) reduces the miss rate on negation (−10 pp) and contradiction (−3 pp) but</w:t>
       </w:r>
       <w:r>
         <w:t xml:space="preserve"> </w:t>
@@ -2563,7 +2563,7 @@
         <w:t xml:space="preserve"> </w:t>
       </w:r>
       <w:r>
-        <w:t xml:space="preserve">it on deletion (+6 pp) — a paradox confirmed by paired McNemar on the same answer set (b = 745, c = 1050, χ² = 51, p &lt; 0.0001).</w:t>
+        <w:t>it on deletion (+6 pp), a paradox confirmed by paired McNemar on the same answer set (b = 745, c = 1050, χ² = 51, p &lt; 0.0001).</w:t>
       </w:r>
     </w:p>
     <w:p>
@@ -2679,7 +2679,7 @@
         <w:pStyle w:val="FirstParagraph"/>
       </w:pPr>
       <w:r>
-        <w:t xml:space="preserve">The most consequential methodological finding is that within-question evaluations overestimate the robustness of trained ASAG graders. The HybridGrader’s IVR_flip nearly doubles between Protocol B and A, and its gaming susceptibility rises by 64% — large effects that translate directly into deployment surprise. We recommend that published ASAG evaluations include cross-question results alongside in-distribution ones, and report the difference explicitly as a robustness drop.</w:t>
+        <w:t>The most consequential methodological finding is that within-question evaluations overestimate the robustness of trained ASAG graders. The HybridGrader’s IVR_flip nearly doubles between Protocol B and A, and its gaming susceptibility rises by 64%, large effects that translate directly into deployment surprise. We recommend that published ASAG evaluations include cross-question results alongside in-distribution ones, and report the difference explicitly as a robustness drop.</w:t>
       </w:r>
     </w:p>
     <w:bookmarkEnd w:id="53"/>
@@ -2723,7 +2723,7 @@
         <w:pStyle w:val="BodyText"/>
       </w:pPr>
       <w:r>
-        <w:t xml:space="preserve">The same checklist mechanism plausibly explains the L1 deletion paradox of Section 5.4. When a domain concept is deleted, the reference has no token to compare against for the missing word while the surrounding tokens still match — the grader reads continued overlap as continued correctness and tolerates the omission. Reference-anchored prompting therefore fails on the same axis on which it succeeds: token-level matching helps detect substitutions and negations but cannot detect what is no longer present to be matched. Prompt engineering or coherence-first instructions could mitigate both gaming vulnerability and deletion blindness; the broader point is that the trade-offs exist and are invisible to single-metric evaluation.</w:t>
+        <w:t>The same checklist mechanism plausibly explains the L1 deletion paradox of Section 5.4. When a domain concept is deleted, the reference has no token to compare against for the missing word while the surrounding tokens still match: the grader reads continued overlap as continued correctness and tolerates the omission. Reference-anchored prompting therefore fails on the same axis on which it succeeds: token-level matching helps detect substitutions and negations but cannot detect what is no longer present to be matched. Prompt engineering or coherence-first instructions could mitigate both gaming vulnerability and deletion blindness; the broader point is that the trade-offs exist and are invisible to single-metric evaluation.</w:t>
       </w:r>
     </w:p>
     <w:bookmarkEnd w:id="55"/>
@@ -2793,7 +2793,7 @@
         <w:pStyle w:val="BodyText"/>
       </w:pPr>
       <w:r>
-        <w:t xml:space="preserve">Applied to the SemEval 2013 Beetle corpus, three findings stand out. (i) A trained ML baseline exhibits a substantial robustness drop under cross-question evaluation (+15.8 pp IVR_flip; +7.4 pp ASR): within-question benchmarks systematically overestimate operational reliability. (ii) A zero-shot LLM grader is markedly more robust on invariance and sensitivity, and less vulnerable to gaming. (iii) Adding the reference answer trades a 45% reduction in invariance violations for a 76% increase in gaming susceptibility — a non-obvious trade-off invisible to any single metric. The broader claim is that robustness should be evaluated alongside accuracy as a first-class quality dimension for any ASAG system intended for high-stakes use, and that the evaluation should be multi-dimensional and grounded in validity theory.</w:t>
+        <w:t>Applied to the SemEval 2013 Beetle corpus, three findings emerge. (i) A trained ML baseline exhibits a substantial robustness drop under cross-question evaluation (+15.8 pp IVR_flip; +7.4 pp ASR): within-question benchmarks systematically overestimate operational reliability. (ii) A zero-shot LLM grader is markedly more robust on invariance and sensitivity, and less vulnerable to gaming. (iii) Adding the reference answer trades a 45% reduction in invariance violations for a 76% increase in gaming susceptibility, a trade-off invisible to any single metric. The broader claim is that robustness should be evaluated alongside accuracy as a first-class quality dimension for any ASAG system intended for high-stakes use, and that the evaluation should be multi-dimensional and grounded in validity theory.</w:t>
       </w:r>
     </w:p>
     <w:p>

</xml_diff>